<commit_message>
feat: complete ENSCORP Confluence migration — living pages, legacy reclassification, AI policy
Phase 1 (D): Published audit checklist (18 items) as new page 7078215 in 07.Auditoría
Phase 2 (A): Populated 11 living pages from .docx sources:
  - 03.Procedimientos: P01-P05 + Desarrollo Software
  - 08.Gobernanza: Actas, Nombramientos, Organigrama, Concienciación, Guía Incorporación
Phase 3 (C): Legacy migration:
  - Moved 5 pages to proper sections (01, 04, 07, 10)
  - Moved 4 templates to Plantillas
  - Merged 7 legacy policy pages into living procedures (P02-P05, SW Dev)
  - Appended AI-policy sections to D02 and D10 from legacy Pol 2.8/2.10
  - Verified 2 duplicates safe for manual deletion
Updated confluence_map.md with all page moves, new entries, and legacy cleanup list.

Co-Authored-By: Claude Opus 4.6 <noreply@anthropic.com>
</commit_message>
<xml_diff>
--- a/01_POLITICAS/D02 Política de Clasificación de la Información.docx
+++ b/01_POLITICAS/D02 Política de Clasificación de la Información.docx
@@ -8153,6 +8153,19 @@
           <w:lang w:val="es-ES"/>
         </w:rPr>
       </w:pPr>
+    </w:p>
+    <w:p>
+      <w:pPr>
+        <w:pStyle w:val="Ttol2"/>
+      </w:pPr>
+      <w:r>
+        <w:t>Tratamiento de información clasificada mediante IA</w:t>
+      </w:r>
+    </w:p>
+    <w:p>
+      <w:r>
+        <w:t>La información clasificada como confidencial o sensible solo podrá ser tratada mediante sistemas de inteligencia artificial cuando dicho tratamiento se realice conforme a la política POL-IA-EXT-ENS-M, que define las condiciones, limitaciones y controles aplicables al uso de inferencia multimodal sobre este tipo de información.</w:t>
+      </w:r>
     </w:p>
     <w:sectPr>
       <w:pgSz w:w="16840" w:h="11900" w:orient="landscape"/>

</xml_diff>